<commit_message>
Fix: tabs del footer VF3 desalineados del centro real de la pagina
Los tabs de centrado (4535) y margen derecho (9071) del footer1.xml
quedaron calculados para margenes viejos. Con los margenes actuales
(1.20/0.79/0.79/0.79, ancho util 9964 twips) el centro real es 4982
y el borde derecho 9964, lo que dejaba el footer corrido a la izquierda
en todo documento generado con la plantilla.
</commit_message>
<xml_diff>
--- a/skills/conectar-docx-format-applier/assets/vf3_blank_template.docx
+++ b/skills/conectar-docx-format-applier/assets/vf3_blank_template.docx
@@ -50,8 +50,8 @@
     <w:pPr>
       <w:pStyle w:val="Footer"/>
       <w:tabs>
-        <w:tab w:val="center" w:pos="4535"/>
-        <w:tab w:val="right" w:pos="9071"/>
+        <w:tab w:val="center" w:pos="4982"/>
+        <w:tab w:val="right" w:pos="9964"/>
       </w:tabs>
       <w:rPr>
         <w:lang w:val="es-ES"/>

</xml_diff>